<commit_message>
Add Week 2 data storytelling report and visualizations
</commit_message>
<xml_diff>
--- a/Week2-Advanced-Visualization-Storytelling/Week2_Advanced_Data_Visualization_Report.docx
+++ b/Week2-Advanced-Visualization-Storytelling/Week2_Advanced_Data_Visualization_Report.docx
@@ -126,7 +126,7 @@
     </w:p>
     <w:p>
       <w:r>
-        <w:t>DOI: https://doi.org/10.24432/C5TG7T. Acquisition: Existing official UCI Mathematics CSV: /home/runner/work/Week1-Student-Performance-EDA-Copy/Week1-Student-Performance-EDA-Copy/data/student-mat.csv. The report uses the official Mathematics course CSV (student-mat.csv), not the Portuguese-language course file.</w:t>
+        <w:t>DOI: https://doi.org/10.24432/C5TG7T. Acquisition: Existing official UCI Mathematics CSV from the Week 1 project. The report uses the official Mathematics course CSV (student-mat.csv), not the Portuguese-language course file.</w:t>
       </w:r>
     </w:p>
     <w:p>
@@ -140,11 +140,21 @@
       </w:r>
     </w:p>
     <w:p>
+      <w:r>
+        <w:br w:type="page"/>
+      </w:r>
+    </w:p>
+    <w:p>
       <w:pPr>
         <w:pStyle w:val="Heading1"/>
       </w:pPr>
       <w:r>
         <w:t>4. Visualization Design and Findings</w:t>
+      </w:r>
+    </w:p>
+    <w:p>
+      <w:r>
+        <w:t>Each figure is presented with its key finding and a rationale for the chosen visual form. The chart sequence moves from overall distribution to relationships, group comparisons, and a combined correlation summary.</w:t>
       </w:r>
     </w:p>
     <w:p>
@@ -217,6 +227,11 @@
       </w:r>
     </w:p>
     <w:p>
+      <w:r>
+        <w:br w:type="page"/>
+      </w:r>
+    </w:p>
+    <w:p>
       <w:pPr>
         <w:pStyle w:val="Heading2"/>
       </w:pPr>
@@ -283,6 +298,11 @@
       </w:r>
       <w:r>
         <w:t>Box plots are a compact way to compare medians, quartiles, variability, and potential extreme values. Red diamonds mark means, making central tendency easier to compare.</w:t>
+      </w:r>
+    </w:p>
+    <w:p>
+      <w:r>
+        <w:br w:type="page"/>
       </w:r>
     </w:p>
     <w:p>
@@ -355,6 +375,11 @@
       </w:r>
     </w:p>
     <w:p>
+      <w:r>
+        <w:br w:type="page"/>
+      </w:r>
+    </w:p>
+    <w:p>
       <w:pPr>
         <w:pStyle w:val="Heading2"/>
       </w:pPr>
@@ -421,6 +446,11 @@
       </w:r>
       <w:r>
         <w:t>A bar chart with confidence intervals compares group means, and sample-size labels prevent a small group from looking as certain as a large one.</w:t>
+      </w:r>
+    </w:p>
+    <w:p>
+      <w:r>
+        <w:br w:type="page"/>
       </w:r>
     </w:p>
     <w:p>
@@ -493,6 +523,11 @@
       </w:r>
     </w:p>
     <w:p>
+      <w:r>
+        <w:br w:type="page"/>
+      </w:r>
+    </w:p>
+    <w:p>
       <w:pPr>
         <w:pStyle w:val="Heading2"/>
       </w:pPr>
@@ -559,6 +594,11 @@
       </w:r>
       <w:r>
         <w:t>A bar chart converts the binary threshold outcome into percentages that are easy to compare. Sample sizes are included because failure groups may be unequal.</w:t>
+      </w:r>
+    </w:p>
+    <w:p>
+      <w:r>
+        <w:br w:type="page"/>
       </w:r>
     </w:p>
     <w:p>

</xml_diff>